<commit_message>
edit main.go to call auth and redirect in folder handlers & middleware, testing postman for login and register.
</commit_message>
<xml_diff>
--- a/snip-task-document.docx
+++ b/snip-task-document.docx
@@ -1383,7 +1383,15 @@
                 <w:sz w:val="20"/>
                 <w:szCs w:val="20"/>
               </w:rPr>
-              <w:t>○ Belum</w:t>
+              <w:t xml:space="preserve">○ </w:t>
+            </w:r>
+            <w:r>
+              <w:rPr>
+                <w:color w:val="7A7870"/>
+                <w:sz w:val="20"/>
+                <w:szCs w:val="20"/>
+              </w:rPr>
+              <w:t>Sudah</w:t>
             </w:r>
           </w:p>
         </w:tc>
@@ -1465,9 +1473,9 @@
       </w:tblPr>
       <w:tblGrid>
         <w:gridCol w:w="547"/>
-        <w:gridCol w:w="4165"/>
+        <w:gridCol w:w="4166"/>
         <w:gridCol w:w="1100"/>
-        <w:gridCol w:w="1295"/>
+        <w:gridCol w:w="1294"/>
         <w:gridCol w:w="2253"/>
       </w:tblGrid>
       <w:tr>
@@ -1672,13 +1680,76 @@
             </w:tcMar>
           </w:tcPr>
           <w:p>
-            <w:r>
+            <w:pPr>
               <w:rPr>
                 <w:color w:val="1A1916"/>
                 <w:sz w:val="20"/>
                 <w:szCs w:val="20"/>
               </w:rPr>
+            </w:pPr>
+            <w:r>
+              <w:rPr>
+                <w:color w:val="1A1916"/>
+                <w:sz w:val="20"/>
+                <w:szCs w:val="20"/>
+              </w:rPr>
               <w:t>Buat tabel users di database</w:t>
+            </w:r>
+          </w:p>
+          <w:p>
+            <w:pPr>
+              <w:pStyle w:val="ListParagraph"/>
+              <w:numPr>
+                <w:ilvl w:val="0"/>
+                <w:numId w:val="4"/>
+              </w:numPr>
+              <w:rPr>
+                <w:sz w:val="20"/>
+                <w:szCs w:val="20"/>
+              </w:rPr>
+            </w:pPr>
+            <w:r>
+              <w:rPr>
+                <w:sz w:val="20"/>
+                <w:szCs w:val="20"/>
+              </w:rPr>
+              <w:t>Create table users</w:t>
+            </w:r>
+          </w:p>
+          <w:p>
+            <w:pPr>
+              <w:pStyle w:val="ListParagraph"/>
+              <w:numPr>
+                <w:ilvl w:val="0"/>
+                <w:numId w:val="4"/>
+              </w:numPr>
+              <w:rPr>
+                <w:sz w:val="20"/>
+                <w:szCs w:val="20"/>
+              </w:rPr>
+            </w:pPr>
+            <w:r>
+              <w:rPr>
+                <w:sz w:val="20"/>
+                <w:szCs w:val="20"/>
+              </w:rPr>
+              <w:t>Install golang encrypt password</w:t>
+            </w:r>
+          </w:p>
+          <w:p>
+            <w:pPr>
+              <w:pStyle w:val="ListParagraph"/>
+              <w:numPr>
+                <w:ilvl w:val="0"/>
+                <w:numId w:val="4"/>
+              </w:numPr>
+            </w:pPr>
+            <w:r>
+              <w:rPr>
+                <w:sz w:val="20"/>
+                <w:szCs w:val="20"/>
+              </w:rPr>
+              <w:t>Install golang generate token</w:t>
             </w:r>
           </w:p>
         </w:tc>
@@ -1736,7 +1807,15 @@
                 <w:sz w:val="20"/>
                 <w:szCs w:val="20"/>
               </w:rPr>
-              <w:t>○ Belum</w:t>
+              <w:t xml:space="preserve">○ </w:t>
+            </w:r>
+            <w:r>
+              <w:rPr>
+                <w:color w:val="7A7870"/>
+                <w:sz w:val="20"/>
+                <w:szCs w:val="20"/>
+              </w:rPr>
+              <w:t>on going</w:t>
             </w:r>
           </w:p>
         </w:tc>
@@ -2514,6 +2593,7 @@
                 <w:sz w:val="20"/>
                 <w:szCs w:val="20"/>
               </w:rPr>
+              <w:lastRenderedPageBreak/>
               <w:t>7</w:t>
             </w:r>
           </w:p>
@@ -4804,6 +4884,7 @@
                 <w:sz w:val="20"/>
                 <w:szCs w:val="20"/>
               </w:rPr>
+              <w:lastRenderedPageBreak/>
               <w:t>6</w:t>
             </w:r>
           </w:p>
@@ -6947,6 +7028,7 @@
         <w:rPr>
           <w:color w:val="1A1916"/>
         </w:rPr>
+        <w:lastRenderedPageBreak/>
         <w:t>Pengalaman pengguna yang baik membutuhkan feedback yang jelas saat proses berlangsung atau terjadi error.</w:t>
       </w:r>
     </w:p>
@@ -7009,7 +7091,6 @@
                 <w:sz w:val="20"/>
                 <w:szCs w:val="20"/>
               </w:rPr>
-              <w:lastRenderedPageBreak/>
               <w:t>No</w:t>
             </w:r>
           </w:p>
@@ -9306,6 +9387,7 @@
                 <w:sz w:val="20"/>
                 <w:szCs w:val="20"/>
               </w:rPr>
+              <w:lastRenderedPageBreak/>
               <w:t>4</w:t>
             </w:r>
           </w:p>
@@ -10156,6 +10238,119 @@
 <file path=word/numbering.xml><?xml version="1.0" encoding="utf-8"?>
 <w:numbering xmlns:wpc="http://schemas.microsoft.com/office/word/2010/wordprocessingCanvas" xmlns:cx="http://schemas.microsoft.com/office/drawing/2014/chartex" xmlns:cx1="http://schemas.microsoft.com/office/drawing/2015/9/8/chartex" xmlns:cx2="http://schemas.microsoft.com/office/drawing/2015/10/21/chartex" xmlns:cx3="http://schemas.microsoft.com/office/drawing/2016/5/9/chartex" xmlns:cx4="http://schemas.microsoft.com/office/drawing/2016/5/10/chartex" xmlns:cx5="http://schemas.microsoft.com/office/drawing/2016/5/11/chartex" xmlns:cx6="http://schemas.microsoft.com/office/drawing/2016/5/12/chartex" xmlns:cx7="http://schemas.microsoft.com/office/drawing/2016/5/13/chartex" xmlns:cx8="http://schemas.microsoft.com/office/drawing/2016/5/14/chartex" xmlns:mc="http://schemas.openxmlformats.org/markup-compatibility/2006" xmlns:aink="http://schemas.microsoft.com/office/drawing/2016/ink" xmlns:am3d="http://schemas.microsoft.com/office/drawing/2017/model3d" xmlns:o="urn:schemas-microsoft-com:office:office" xmlns:r="http://schemas.openxmlformats.org/officeDocument/2006/relationships" xmlns:m="http://schemas.openxmlformats.org/officeDocument/2006/math" xmlns:v="urn:schemas-microsoft-com:vml" xmlns:wp14="http://schemas.microsoft.com/office/word/2010/wordprocessingDrawing" xmlns:wp="http://schemas.openxmlformats.org/drawingml/2006/wordprocessingDrawing" xmlns:w10="urn:schemas-microsoft-com:office:word" xmlns:w="http://schemas.openxmlformats.org/wordprocessingml/2006/main" xmlns:w14="http://schemas.microsoft.com/office/word/2010/wordml" xmlns:w15="http://schemas.microsoft.com/office/word/2012/wordml" xmlns:w16cex="http://schemas.microsoft.com/office/word/2018/wordml/cex" xmlns:w16cid="http://schemas.microsoft.com/office/word/2016/wordml/cid" xmlns:w16="http://schemas.microsoft.com/office/word/2018/wordml" xmlns:w16se="http://schemas.microsoft.com/office/word/2015/wordml/symex" xmlns:wpg="http://schemas.microsoft.com/office/word/2010/wordprocessingGroup" xmlns:wpi="http://schemas.microsoft.com/office/word/2010/wordprocessingInk" xmlns:wne="http://schemas.microsoft.com/office/word/2006/wordml" xmlns:wps="http://schemas.microsoft.com/office/word/2010/wordprocessingShape" mc:Ignorable="w14 w15 w16se w16cid w16 w16cex wp14">
   <w:abstractNum w:abstractNumId="0" w15:restartNumberingAfterBreak="0">
+    <w:nsid w:val="096B7A30"/>
+    <w:multiLevelType w:val="hybridMultilevel"/>
+    <w:tmpl w:val="A03A825C"/>
+    <w:lvl w:ilvl="0" w:tplc="38090001">
+      <w:start w:val="1"/>
+      <w:numFmt w:val="bullet"/>
+      <w:lvlText w:val=""/>
+      <w:lvlJc w:val="left"/>
+      <w:pPr>
+        <w:ind w:left="720" w:hanging="360"/>
+      </w:pPr>
+      <w:rPr>
+        <w:rFonts w:ascii="Symbol" w:hAnsi="Symbol" w:hint="default"/>
+      </w:rPr>
+    </w:lvl>
+    <w:lvl w:ilvl="1" w:tplc="38090003" w:tentative="1">
+      <w:start w:val="1"/>
+      <w:numFmt w:val="bullet"/>
+      <w:lvlText w:val="o"/>
+      <w:lvlJc w:val="left"/>
+      <w:pPr>
+        <w:ind w:left="1440" w:hanging="360"/>
+      </w:pPr>
+      <w:rPr>
+        <w:rFonts w:ascii="Courier New" w:hAnsi="Courier New" w:cs="Courier New" w:hint="default"/>
+      </w:rPr>
+    </w:lvl>
+    <w:lvl w:ilvl="2" w:tplc="38090005" w:tentative="1">
+      <w:start w:val="1"/>
+      <w:numFmt w:val="bullet"/>
+      <w:lvlText w:val=""/>
+      <w:lvlJc w:val="left"/>
+      <w:pPr>
+        <w:ind w:left="2160" w:hanging="360"/>
+      </w:pPr>
+      <w:rPr>
+        <w:rFonts w:ascii="Wingdings" w:hAnsi="Wingdings" w:hint="default"/>
+      </w:rPr>
+    </w:lvl>
+    <w:lvl w:ilvl="3" w:tplc="38090001" w:tentative="1">
+      <w:start w:val="1"/>
+      <w:numFmt w:val="bullet"/>
+      <w:lvlText w:val=""/>
+      <w:lvlJc w:val="left"/>
+      <w:pPr>
+        <w:ind w:left="2880" w:hanging="360"/>
+      </w:pPr>
+      <w:rPr>
+        <w:rFonts w:ascii="Symbol" w:hAnsi="Symbol" w:hint="default"/>
+      </w:rPr>
+    </w:lvl>
+    <w:lvl w:ilvl="4" w:tplc="38090003" w:tentative="1">
+      <w:start w:val="1"/>
+      <w:numFmt w:val="bullet"/>
+      <w:lvlText w:val="o"/>
+      <w:lvlJc w:val="left"/>
+      <w:pPr>
+        <w:ind w:left="3600" w:hanging="360"/>
+      </w:pPr>
+      <w:rPr>
+        <w:rFonts w:ascii="Courier New" w:hAnsi="Courier New" w:cs="Courier New" w:hint="default"/>
+      </w:rPr>
+    </w:lvl>
+    <w:lvl w:ilvl="5" w:tplc="38090005" w:tentative="1">
+      <w:start w:val="1"/>
+      <w:numFmt w:val="bullet"/>
+      <w:lvlText w:val=""/>
+      <w:lvlJc w:val="left"/>
+      <w:pPr>
+        <w:ind w:left="4320" w:hanging="360"/>
+      </w:pPr>
+      <w:rPr>
+        <w:rFonts w:ascii="Wingdings" w:hAnsi="Wingdings" w:hint="default"/>
+      </w:rPr>
+    </w:lvl>
+    <w:lvl w:ilvl="6" w:tplc="38090001" w:tentative="1">
+      <w:start w:val="1"/>
+      <w:numFmt w:val="bullet"/>
+      <w:lvlText w:val=""/>
+      <w:lvlJc w:val="left"/>
+      <w:pPr>
+        <w:ind w:left="5040" w:hanging="360"/>
+      </w:pPr>
+      <w:rPr>
+        <w:rFonts w:ascii="Symbol" w:hAnsi="Symbol" w:hint="default"/>
+      </w:rPr>
+    </w:lvl>
+    <w:lvl w:ilvl="7" w:tplc="38090003" w:tentative="1">
+      <w:start w:val="1"/>
+      <w:numFmt w:val="bullet"/>
+      <w:lvlText w:val="o"/>
+      <w:lvlJc w:val="left"/>
+      <w:pPr>
+        <w:ind w:left="5760" w:hanging="360"/>
+      </w:pPr>
+      <w:rPr>
+        <w:rFonts w:ascii="Courier New" w:hAnsi="Courier New" w:cs="Courier New" w:hint="default"/>
+      </w:rPr>
+    </w:lvl>
+    <w:lvl w:ilvl="8" w:tplc="38090005" w:tentative="1">
+      <w:start w:val="1"/>
+      <w:numFmt w:val="bullet"/>
+      <w:lvlText w:val=""/>
+      <w:lvlJc w:val="left"/>
+      <w:pPr>
+        <w:ind w:left="6480" w:hanging="360"/>
+      </w:pPr>
+      <w:rPr>
+        <w:rFonts w:ascii="Wingdings" w:hAnsi="Wingdings" w:hint="default"/>
+      </w:rPr>
+    </w:lvl>
+  </w:abstractNum>
+  <w:abstractNum w:abstractNumId="1" w15:restartNumberingAfterBreak="0">
     <w:nsid w:val="0BBE1FCD"/>
     <w:multiLevelType w:val="hybridMultilevel"/>
     <w:tmpl w:val="A948A080"/>
@@ -10269,7 +10464,7 @@
       </w:rPr>
     </w:lvl>
   </w:abstractNum>
-  <w:abstractNum w:abstractNumId="1" w15:restartNumberingAfterBreak="0">
+  <w:abstractNum w:abstractNumId="2" w15:restartNumberingAfterBreak="0">
     <w:nsid w:val="2389037A"/>
     <w:multiLevelType w:val="hybridMultilevel"/>
     <w:tmpl w:val="FDC6265C"/>
@@ -10333,7 +10528,7 @@
       <w:lvlJc w:val="left"/>
     </w:lvl>
   </w:abstractNum>
-  <w:abstractNum w:abstractNumId="2" w15:restartNumberingAfterBreak="0">
+  <w:abstractNum w:abstractNumId="3" w15:restartNumberingAfterBreak="0">
     <w:nsid w:val="566A6ED7"/>
     <w:multiLevelType w:val="hybridMultilevel"/>
     <w:tmpl w:val="07F22CE6"/>
@@ -10420,18 +10615,21 @@
     </w:lvl>
   </w:abstractNum>
   <w:num w:numId="1">
+    <w:abstractNumId w:val="3"/>
+    <w:lvlOverride w:ilvl="0">
+      <w:startOverride w:val="1"/>
+    </w:lvlOverride>
+  </w:num>
+  <w:num w:numId="2">
     <w:abstractNumId w:val="2"/>
     <w:lvlOverride w:ilvl="0">
       <w:startOverride w:val="1"/>
     </w:lvlOverride>
   </w:num>
-  <w:num w:numId="2">
+  <w:num w:numId="3">
     <w:abstractNumId w:val="1"/>
-    <w:lvlOverride w:ilvl="0">
-      <w:startOverride w:val="1"/>
-    </w:lvlOverride>
   </w:num>
-  <w:num w:numId="3">
+  <w:num w:numId="4">
     <w:abstractNumId w:val="0"/>
   </w:num>
 </w:numbering>

</xml_diff>

<commit_message>
add feature matching password in new_password.html page
</commit_message>
<xml_diff>
--- a/snip-task-document.docx
+++ b/snip-task-document.docx
@@ -1473,9 +1473,9 @@
       </w:tblPr>
       <w:tblGrid>
         <w:gridCol w:w="547"/>
-        <w:gridCol w:w="4166"/>
+        <w:gridCol w:w="4165"/>
         <w:gridCol w:w="1100"/>
-        <w:gridCol w:w="1295"/>
+        <w:gridCol w:w="1296"/>
         <w:gridCol w:w="2252"/>
       </w:tblGrid>
       <w:tr>
@@ -2431,7 +2431,15 @@
                 <w:sz w:val="20"/>
                 <w:szCs w:val="20"/>
               </w:rPr>
-              <w:t>○ Belum</w:t>
+              <w:t xml:space="preserve">○ </w:t>
+            </w:r>
+            <w:r>
+              <w:rPr>
+                <w:color w:val="7A7870"/>
+                <w:sz w:val="20"/>
+                <w:szCs w:val="20"/>
+              </w:rPr>
+              <w:t>on progress</w:t>
             </w:r>
           </w:p>
         </w:tc>
@@ -3073,7 +3081,15 @@
                 <w:sz w:val="20"/>
                 <w:szCs w:val="20"/>
               </w:rPr>
-              <w:t>○ Belum</w:t>
+              <w:t xml:space="preserve">○ </w:t>
+            </w:r>
+            <w:r>
+              <w:rPr>
+                <w:color w:val="7A7870"/>
+                <w:sz w:val="20"/>
+                <w:szCs w:val="20"/>
+              </w:rPr>
+              <w:t>Sudah</w:t>
             </w:r>
           </w:p>
         </w:tc>
@@ -3217,7 +3233,15 @@
                 <w:sz w:val="20"/>
                 <w:szCs w:val="20"/>
               </w:rPr>
-              <w:t>○ Belum</w:t>
+              <w:t xml:space="preserve">○ </w:t>
+            </w:r>
+            <w:r>
+              <w:rPr>
+                <w:color w:val="7A7870"/>
+                <w:sz w:val="20"/>
+                <w:szCs w:val="20"/>
+              </w:rPr>
+              <w:t>Sudah</w:t>
             </w:r>
           </w:p>
         </w:tc>
@@ -3361,7 +3385,15 @@
                 <w:sz w:val="20"/>
                 <w:szCs w:val="20"/>
               </w:rPr>
-              <w:t>○ Belum</w:t>
+              <w:t xml:space="preserve">○ </w:t>
+            </w:r>
+            <w:r>
+              <w:rPr>
+                <w:color w:val="7A7870"/>
+                <w:sz w:val="20"/>
+                <w:szCs w:val="20"/>
+              </w:rPr>
+              <w:t>Sudah</w:t>
             </w:r>
           </w:p>
         </w:tc>
@@ -3505,7 +3537,15 @@
                 <w:sz w:val="20"/>
                 <w:szCs w:val="20"/>
               </w:rPr>
-              <w:t>○ Belum</w:t>
+              <w:t xml:space="preserve">○ </w:t>
+            </w:r>
+            <w:r>
+              <w:rPr>
+                <w:color w:val="7A7870"/>
+                <w:sz w:val="20"/>
+                <w:szCs w:val="20"/>
+              </w:rPr>
+              <w:t>Belum</w:t>
             </w:r>
           </w:p>
         </w:tc>
@@ -3649,7 +3689,15 @@
                 <w:sz w:val="20"/>
                 <w:szCs w:val="20"/>
               </w:rPr>
-              <w:t>○ Belum</w:t>
+              <w:t>○</w:t>
+            </w:r>
+            <w:r>
+              <w:rPr>
+                <w:color w:val="7A7870"/>
+                <w:sz w:val="20"/>
+                <w:szCs w:val="20"/>
+              </w:rPr>
+              <w:t xml:space="preserve"> Belum</w:t>
             </w:r>
           </w:p>
         </w:tc>
@@ -4290,7 +4338,15 @@
                 <w:sz w:val="20"/>
                 <w:szCs w:val="20"/>
               </w:rPr>
-              <w:t>○ Belum</w:t>
+              <w:t xml:space="preserve">○ </w:t>
+            </w:r>
+            <w:r>
+              <w:rPr>
+                <w:color w:val="7A7870"/>
+                <w:sz w:val="20"/>
+                <w:szCs w:val="20"/>
+              </w:rPr>
+              <w:t>Sudah</w:t>
             </w:r>
           </w:p>
         </w:tc>
@@ -5237,9 +5293,9 @@
       </w:tblPr>
       <w:tblGrid>
         <w:gridCol w:w="547"/>
-        <w:gridCol w:w="4161"/>
+        <w:gridCol w:w="4159"/>
         <w:gridCol w:w="1100"/>
-        <w:gridCol w:w="1295"/>
+        <w:gridCol w:w="1297"/>
         <w:gridCol w:w="2257"/>
       </w:tblGrid>
       <w:tr>
@@ -5508,7 +5564,15 @@
                 <w:sz w:val="20"/>
                 <w:szCs w:val="20"/>
               </w:rPr>
-              <w:t>○ Belum</w:t>
+              <w:t xml:space="preserve">○ </w:t>
+            </w:r>
+            <w:r>
+              <w:rPr>
+                <w:color w:val="7A7870"/>
+                <w:sz w:val="20"/>
+                <w:szCs w:val="20"/>
+              </w:rPr>
+              <w:t>On Progress</w:t>
             </w:r>
           </w:p>
         </w:tc>

</xml_diff>